<commit_message>
fix: reports-export-menu.png was a byte-identical duplicate of another screenshot
Caught during final hackathon-submission QA: the screenshot-capture agent had
saved the exact same full-page investigation-results capture under both
ioc-investigation-results.png and reports-export-menu.png (verified identical
by hash). Replaced with a real, distinct capture cropped to the actual export
button group. Rebuilt the one PDF that embeds this figure.
</commit_message>
<xml_diff>
--- a/documentation/HORIZON_GRID_HACKATHON_SUBMISSION.docx
+++ b/documentation/HORIZON_GRID_HACKATHON_SUBMISSION.docx
@@ -186,12 +186,12 @@
           <wp:inline distB="0" distL="0" distR="0" distT="0">
             <wp:extent cx="6629400" cy="4322921"/>
             <wp:effectExtent b="0" l="0" r="0" t="0"/>
-            <wp:docPr id="2" name="image-l0-8BlGmV_bWQAcZzUVsg.png"/>
+            <wp:docPr id="2" name="image-MMjGiiiMXMa_XixFwuMR5.png"/>
             <a:graphic>
               <a:graphicData uri="http://schemas.openxmlformats.org/drawingml/2006/picture">
                 <pic:pic>
                   <pic:nvPicPr>
-                    <pic:cNvPr id="2" name="image-l0-8BlGmV_bWQAcZzUVsg.png" descr="Figure 1"/>
+                    <pic:cNvPr id="2" name="image-MMjGiiiMXMa_XixFwuMR5.png" descr="Figure 1"/>
                     <pic:cNvPicPr/>
                   </pic:nvPicPr>
                   <pic:blipFill>
@@ -625,12 +625,12 @@
           <wp:inline distB="0" distL="0" distR="0" distT="0">
             <wp:extent cx="6629400" cy="4603750"/>
             <wp:effectExtent b="0" l="0" r="0" t="0"/>
-            <wp:docPr id="4" name="image-2hpFbUJQVSxdS90lX1HSt.png"/>
+            <wp:docPr id="4" name="image-wZMpxNdMRcU2ThNczkMwI.png"/>
             <a:graphic>
               <a:graphicData uri="http://schemas.openxmlformats.org/drawingml/2006/picture">
                 <pic:pic>
                   <pic:nvPicPr>
-                    <pic:cNvPr id="4" name="image-2hpFbUJQVSxdS90lX1HSt.png" descr="Figure 2"/>
+                    <pic:cNvPr id="4" name="image-wZMpxNdMRcU2ThNczkMwI.png" descr="Figure 2"/>
                     <pic:cNvPicPr/>
                   </pic:nvPicPr>
                   <pic:blipFill>
@@ -1226,12 +1226,12 @@
           <wp:inline distB="0" distL="0" distR="0" distT="0">
             <wp:extent cx="6629400" cy="4603750"/>
             <wp:effectExtent b="0" l="0" r="0" t="0"/>
-            <wp:docPr id="6" name="image-jX0k88kNoIUlsFt9BhrZi.png"/>
+            <wp:docPr id="6" name="image-JUGCpYnjXRXl1JFhiw4Cm.png"/>
             <a:graphic>
               <a:graphicData uri="http://schemas.openxmlformats.org/drawingml/2006/picture">
                 <pic:pic>
                   <pic:nvPicPr>
-                    <pic:cNvPr id="6" name="image-jX0k88kNoIUlsFt9BhrZi.png" descr="Figure 3"/>
+                    <pic:cNvPr id="6" name="image-JUGCpYnjXRXl1JFhiw4Cm.png" descr="Figure 3"/>
                     <pic:cNvPicPr/>
                   </pic:nvPicPr>
                   <pic:blipFill>
@@ -1319,12 +1319,12 @@
           <wp:inline distB="0" distL="0" distR="0" distT="0">
             <wp:extent cx="6629400" cy="4603750"/>
             <wp:effectExtent b="0" l="0" r="0" t="0"/>
-            <wp:docPr id="8" name="image-KLPGGa4giACYp3JtT_VGf.png"/>
+            <wp:docPr id="8" name="image-L2vo1VUDb-oF-CjUtuL4y.png"/>
             <a:graphic>
               <a:graphicData uri="http://schemas.openxmlformats.org/drawingml/2006/picture">
                 <pic:pic>
                   <pic:nvPicPr>
-                    <pic:cNvPr id="8" name="image-KLPGGa4giACYp3JtT_VGf.png" descr="Figure 4"/>
+                    <pic:cNvPr id="8" name="image-L2vo1VUDb-oF-CjUtuL4y.png" descr="Figure 4"/>
                     <pic:cNvPicPr/>
                   </pic:nvPicPr>
                   <pic:blipFill>
@@ -1421,14 +1421,14 @@
         <w:rPr/>
         <w:drawing>
           <wp:inline distB="0" distL="0" distR="0" distT="0">
-            <wp:extent cx="6629400" cy="4603750"/>
+            <wp:extent cx="3914775" cy="685800"/>
             <wp:effectExtent b="0" l="0" r="0" t="0"/>
-            <wp:docPr id="10" name="image-ddvAVu2RBuW6K_aVM_dId.png"/>
+            <wp:docPr id="10" name="image-z6UlBIYG8usQJVKGSKn_V.png"/>
             <a:graphic>
               <a:graphicData uri="http://schemas.openxmlformats.org/drawingml/2006/picture">
                 <pic:pic>
                   <pic:nvPicPr>
-                    <pic:cNvPr id="10" name="image-ddvAVu2RBuW6K_aVM_dId.png" descr="Figure 5"/>
+                    <pic:cNvPr id="10" name="image-z6UlBIYG8usQJVKGSKn_V.png" descr="Figure 5"/>
                     <pic:cNvPicPr/>
                   </pic:nvPicPr>
                   <pic:blipFill>
@@ -1441,7 +1441,7 @@
                   <pic:spPr>
                     <a:xfrm>
                       <a:off x="0" y="0"/>
-                      <a:ext cx="6629400" cy="4603750"/>
+                      <a:ext cx="3914775" cy="685800"/>
                     </a:xfrm>
                     <a:prstGeom prst="rect"/>
                   </pic:spPr>
@@ -3816,12 +3816,12 @@
           <wp:inline distB="0" distL="0" distR="0" distT="0">
             <wp:extent cx="6629400" cy="4322921"/>
             <wp:effectExtent b="0" l="0" r="0" t="0"/>
-            <wp:docPr id="12" name="image-ktKJzaYiCdYDTA5Lo4gaO.png"/>
+            <wp:docPr id="12" name="image-ezzdTewejkhs4rZ4nZmss.png"/>
             <a:graphic>
               <a:graphicData uri="http://schemas.openxmlformats.org/drawingml/2006/picture">
                 <pic:pic>
                   <pic:nvPicPr>
-                    <pic:cNvPr id="12" name="image-ktKJzaYiCdYDTA5Lo4gaO.png" descr="Figure 6"/>
+                    <pic:cNvPr id="12" name="image-ezzdTewejkhs4rZ4nZmss.png" descr="Figure 6"/>
                     <pic:cNvPicPr/>
                   </pic:nvPicPr>
                   <pic:blipFill>
@@ -4180,12 +4180,12 @@
           <wp:inline distB="0" distL="0" distR="0" distT="0">
             <wp:extent cx="6629400" cy="4143375"/>
             <wp:effectExtent b="0" l="0" r="0" t="0"/>
-            <wp:docPr id="14" name="image-HqKxw7zdHQzy1-F7Rf0iq.png"/>
+            <wp:docPr id="14" name="image-gsCc_L72qhfM7bloPElJC.png"/>
             <a:graphic>
               <a:graphicData uri="http://schemas.openxmlformats.org/drawingml/2006/picture">
                 <pic:pic>
                   <pic:nvPicPr>
-                    <pic:cNvPr id="14" name="image-HqKxw7zdHQzy1-F7Rf0iq.png" descr="Figure 7"/>
+                    <pic:cNvPr id="14" name="image-gsCc_L72qhfM7bloPElJC.png" descr="Figure 7"/>
                     <pic:cNvPicPr/>
                   </pic:nvPicPr>
                   <pic:blipFill>
@@ -4219,12 +4219,12 @@
           <wp:inline distB="0" distL="0" distR="0" distT="0">
             <wp:extent cx="6629400" cy="4143375"/>
             <wp:effectExtent b="0" l="0" r="0" t="0"/>
-            <wp:docPr id="16" name="image-Yoe1k9skDC2Y9-vnrCV-Y.png"/>
+            <wp:docPr id="16" name="image-V70fitdWQ0MFj3gG98Oi1.png"/>
             <a:graphic>
               <a:graphicData uri="http://schemas.openxmlformats.org/drawingml/2006/picture">
                 <pic:pic>
                   <pic:nvPicPr>
-                    <pic:cNvPr id="16" name="image-Yoe1k9skDC2Y9-vnrCV-Y.png" descr="Figure 8"/>
+                    <pic:cNvPr id="16" name="image-V70fitdWQ0MFj3gG98Oi1.png" descr="Figure 8"/>
                     <pic:cNvPicPr/>
                   </pic:nvPicPr>
                   <pic:blipFill>

</xml_diff>